<commit_message>
Shorter conclusion; Future Scope removed
The conclusion ran to four paragraphs that restated Section 5 at length.
It is now three: what was found, what the method makes portable, and
what the work makes cheap for whoever comes next.

Future Scope is gone entirely -- an introduction, six subsections and a
summary, written for a systems paper that no longer exists. Nothing
substantive goes with it. Its one disclosure that mattered, that the
ensemble weights were grid-searched on the evaluation corpus, is already
recorded in 5.7 and again in Section 8. The two directions worth
keeping, validation on a corpus that publishes its annotations and the
open question of what a bounded earliness term costs a real method, are
folded into the last paragraph of the conclusion.

41 pages to 39. References unchanged at 32, no orphans.
</commit_message>
<xml_diff>
--- a/paper/Precrash.docx
+++ b/paper/Precrash.docx
@@ -29205,7 +29205,7 @@
           <w:sz w:val="24"/>
           <w:szCs w:val="24"/>
         </w:rPr>
-        <w:t>A composite metric that adds an unbounded earliness term to bounded discrimination terms does not measure what its name suggests. On a live accident-anticipation benchmark we measured the magnitude: the earliness terms are worth 5.70 times what the discrimination terms contribute to a submission that reads nothing, they are maximised exactly by a constant, and that constant scores within 0.14874 of the winning entry while matching the eighth-placed team at the precision the leaderboard displays.</w:t>
+        <w:t xml:space="preserve">A composite score that adds an unbounded earliness term to bounded discrimination terms does not measure what its name suggests. On a live accident-anticipation benchmark the earliness terms are worth 5.70 times what discrimination contributes to a submission that reads nothing; they are maximised exactly by a constant; and that constant scores within 0.14874 of the winning entry, matching the eighth-placed team at the precision the leaderboard displays. Our own entry, a training-free ensemble, placed ninth of thirteen and scores below it.</w:t>
       </w:r>
     </w:p>
     <w:p>
@@ -29224,7 +29224,7 @@
           <w:sz w:val="24"/>
           <w:szCs w:val="24"/>
         </w:rPr>
-        <w:t>Using twenty-four video-blind submissions as probes we recovered most of the metric's functional form from outside the competition. The score falls at exactly one sixtieth of a point per frame of delay, confirmed by a one-frame experiment and predicting held-out step-like curves to within 6.4 × 10⁻³. The same probes recovered the support and mean of the withheld accident-onset distribution, and established a second result we did not set out to find: three curves crossing the threshold at the same frame score 0.091 apart, a spread the published formula cannot produce. The benchmark's stated definition does not reproduce its own scorer.</w:t>
+        <w:t xml:space="preserve">The method that established this is as portable as the finding. Twenty-four submissions, not one of which opened a video frame, were enough to recover the score's slope to a sixtieth of a point per frame of delay, to bound the support and mean of an accident-onset distribution no entrant has seen, and to establish that the benchmark's published formula does not reproduce its own scorer. A leaderboard that accepts arbitrary submissions is an instrument, and any benchmark that accepts one can be measured from outside in this way.</w:t>
       </w:r>
     </w:p>
     <w:p>
@@ -29243,453 +29243,7 @@
           <w:sz w:val="24"/>
           <w:szCs w:val="24"/>
         </w:rPr>
-        <w:t>The remedy is cheap. Bound the earliness term and condition it on a fixed operating point of the discrimination metric, so that a method must classify before its timing is counted. And run the control: a constant costs one submission and settles in an afternoon a question that otherwise propagates through a literature.</w:t>
-      </w:r>
-    </w:p>
-    <w:p>
-      <w:pPr>
-        <w:spacing w:before="60" w:after="100" w:line="276" w:lineRule="auto"/>
-        <w:jc w:val="both"/>
-        <w:rPr>
-          <w:rFonts w:eastAsia="Times New Roman"/>
-          <w:sz w:val="24"/>
-          <w:szCs w:val="24"/>
-        </w:rPr>
-      </w:pPr>
-      <w:r>
-        <w:rPr>
-          <w:rFonts w:eastAsia="Times New Roman"/>
-          <w:sz w:val="24"/>
-          <w:szCs w:val="24"/>
-        </w:rPr>
-        <w:t>We report our own entry, a training-free ensemble of vision–language similarity, a motion signal and a text-anchored prior, as the case study. It placed ninth of thirteen and it scores below the constant. We had selected its sentence encoder by minimising the crossover frame — the only quantity this benchmark lets an entrant compute, and the quantity a constant drives to zero. That is what a withheld label set does to a research programme, and it is the reason this paper reports a metric rather than a method.</w:t>
-      </w:r>
-    </w:p>
-    <w:p>
-      <w:pPr>
-        <w:spacing w:after="60"/>
-        <w:rPr>
-          <w:sz w:val="24"/>
-          <w:szCs w:val="24"/>
-        </w:rPr>
-      </w:pPr>
-    </w:p>
-    <w:p>
-      <w:pPr>
-        <w:spacing w:before="60" w:after="100" w:line="276" w:lineRule="auto"/>
-        <w:jc w:val="both"/>
-        <w:rPr>
-          <w:rFonts w:eastAsia="Times New Roman"/>
-          <w:sz w:val="24"/>
-          <w:szCs w:val="24"/>
-        </w:rPr>
-      </w:pPr>
-      <w:r>
-        <w:rPr>
-          <w:rFonts w:eastAsia="Times New Roman"/>
-          <w:sz w:val="24"/>
-          <w:szCs w:val="24"/>
-        </w:rPr>
-        <w:t>MATERIAL PARKED — the Future Scope section below is superseded by Section 8, Limitations, and is not for submission in this position. Three of its subsections describe work that remains worth doing: cross-dataset validation on a labelled corpus, edge deployment, and the driver-behaviour and regulatory discussion. Fold those into a short future-work paragraph at the end of Section 9. Note that 7.1 states the ensemble weights were grid-searched on the evaluation corpus, which contradicts the zero-shot claim and must be resolved before submission.</w:t>
-      </w:r>
-    </w:p>
-    <w:p>
-      <w:pPr>
-        <w:spacing w:before="220" w:after="80"/>
-        <w:rPr>
-          <w:sz w:val="24"/>
-          <w:szCs w:val="24"/>
-        </w:rPr>
-      </w:pPr>
-      <w:r>
-        <w:rPr>
-          <w:rFonts w:eastAsia="Times New Roman"/>
-          <w:b/>
-          <w:bCs/>
-          <w:sz w:val="24"/>
-          <w:szCs w:val="24"/>
-        </w:rPr>
-        <w:t>7. Future Scope</w:t>
-      </w:r>
-    </w:p>
-    <w:p>
-      <w:pPr>
-        <w:spacing w:before="60" w:after="100" w:line="276" w:lineRule="auto"/>
-        <w:jc w:val="both"/>
-        <w:rPr>
-          <w:sz w:val="24"/>
-          <w:szCs w:val="24"/>
-        </w:rPr>
-      </w:pPr>
-      <w:r>
-        <w:rPr>
-          <w:rFonts w:eastAsia="Times New Roman"/>
-          <w:sz w:val="24"/>
-          <w:szCs w:val="24"/>
-        </w:rPr>
-        <w:t>While the results presented in this work establish a compelling proof-of-concept for zero-shot multimodal accident anticipation, several directions for methodological extension and practical deployment advancement are identified:</w:t>
-      </w:r>
-    </w:p>
-    <w:p>
-      <w:pPr>
-        <w:spacing w:before="160" w:after="60"/>
-        <w:rPr>
-          <w:sz w:val="24"/>
-          <w:szCs w:val="24"/>
-        </w:rPr>
-      </w:pPr>
-      <w:r>
-        <w:rPr>
-          <w:rFonts w:eastAsia="Times New Roman"/>
-          <w:b/>
-          <w:bCs/>
-          <w:i/>
-          <w:iCs/>
-          <w:sz w:val="24"/>
-          <w:szCs w:val="24"/>
-        </w:rPr>
-        <w:t>7.1. Adaptive Ensemble Weight Learning</w:t>
-      </w:r>
-    </w:p>
-    <w:p>
-      <w:pPr>
-        <w:spacing w:before="60" w:after="100" w:line="276" w:lineRule="auto"/>
-        <w:jc w:val="both"/>
-        <w:rPr>
-          <w:sz w:val="24"/>
-          <w:szCs w:val="24"/>
-        </w:rPr>
-      </w:pPr>
-      <w:r>
-        <w:rPr>
-          <w:rFonts w:eastAsia="Times New Roman"/>
-          <w:sz w:val="24"/>
-          <w:szCs w:val="24"/>
-        </w:rPr>
-        <w:t xml:space="preserve">The fusion weights in the current framework (α = 0.55, β = 0.25, γ = 0.20) were empirically determined through grid search on the full evaluation corpus. A natural extension is the development of a </w:t>
-      </w:r>
-      <w:r>
-        <w:rPr>
-          <w:rFonts w:eastAsia="Times New Roman"/>
-          <w:i/>
-          <w:iCs/>
-          <w:sz w:val="24"/>
-          <w:szCs w:val="24"/>
-        </w:rPr>
-        <w:t>dynamic, context-aware weight adaptation mechanism</w:t>
-      </w:r>
-      <w:r>
-        <w:rPr>
-          <w:rFonts w:eastAsia="Times New Roman"/>
-          <w:sz w:val="24"/>
-          <w:szCs w:val="24"/>
-        </w:rPr>
-        <w:t xml:space="preserve"> that adjusts modality contributions in real time based on environmental conditions — for instance, elevating the optical flow weight during adverse weather (when visual semantics degrade) or up-weighting the NLP prior in semantically complex urban intersections (where kinematic signals are ambiguous). Such adaptive fusion could be implemented through a lightweight meta-learner trained on a small set of environment-labelled examples, or through attention mechanisms operating over modality-specific confidence estimates, preserving the zero-shot character of the core pipeline.</w:t>
-      </w:r>
-    </w:p>
-    <w:p>
-      <w:pPr>
-        <w:spacing w:before="160" w:after="60"/>
-        <w:rPr>
-          <w:sz w:val="24"/>
-          <w:szCs w:val="24"/>
-        </w:rPr>
-      </w:pPr>
-      <w:r>
-        <w:rPr>
-          <w:rFonts w:eastAsia="Times New Roman"/>
-          <w:b/>
-          <w:bCs/>
-          <w:i/>
-          <w:iCs/>
-          <w:sz w:val="24"/>
-          <w:szCs w:val="24"/>
-        </w:rPr>
-        <w:t>7.2. Integration of Audio and V2X Communication Modalities</w:t>
-      </w:r>
-    </w:p>
-    <w:p>
-      <w:pPr>
-        <w:spacing w:before="60" w:after="100" w:line="276" w:lineRule="auto"/>
-        <w:jc w:val="both"/>
-        <w:rPr>
-          <w:sz w:val="24"/>
-          <w:szCs w:val="24"/>
-        </w:rPr>
-      </w:pPr>
-      <w:r>
-        <w:rPr>
-          <w:rFonts w:eastAsia="Times New Roman"/>
-          <w:sz w:val="24"/>
-          <w:szCs w:val="24"/>
-        </w:rPr>
-        <w:t xml:space="preserve">The current framework operates exclusively on visual modalities derived from the dashcam video stream. Contemporary dashcam systems increasingly capture </w:t>
-      </w:r>
-      <w:r>
-        <w:rPr>
-          <w:rFonts w:eastAsia="Times New Roman"/>
-          <w:i/>
-          <w:iCs/>
-          <w:sz w:val="24"/>
-          <w:szCs w:val="24"/>
-        </w:rPr>
-        <w:t>synchronised audio streams</w:t>
-      </w:r>
-      <w:r>
-        <w:rPr>
-          <w:rFonts w:eastAsia="Times New Roman"/>
-          <w:sz w:val="24"/>
-          <w:szCs w:val="24"/>
-        </w:rPr>
-        <w:t xml:space="preserve"> — which encode horn activations, tyre screeching, and sudden deceleration sounds — that carry independent and early precursor signals for imminent collision events. Furthermore, the proliferation of Vehicle-to-Everything (V2X) communication infrastructure in smart city deployments provides access to </w:t>
-      </w:r>
-      <w:r>
-        <w:rPr>
-          <w:rFonts w:eastAsia="Times New Roman"/>
-          <w:i/>
-          <w:iCs/>
-          <w:sz w:val="24"/>
-          <w:szCs w:val="24"/>
-        </w:rPr>
-        <w:t>inter-vehicle kinematic state broadcasts</w:t>
-      </w:r>
-      <w:r>
-        <w:rPr>
-          <w:rFonts w:eastAsia="Times New Roman"/>
-          <w:sz w:val="24"/>
-          <w:szCs w:val="24"/>
-        </w:rPr>
-        <w:t xml:space="preserve"> (position, velocity, heading) that extend the anticipation horizon beyond the visual field of view. Future work will investigate the integration of audio-based risk scoring — using pre-trained audio event classifiers such as AudioCLIP — and V2X data streams as additional ensemble modalities, with the goal of further reducing the mean crossover frame below 20.</w:t>
-      </w:r>
-    </w:p>
-    <w:p>
-      <w:pPr>
-        <w:spacing w:before="160" w:after="60"/>
-        <w:rPr>
-          <w:sz w:val="24"/>
-          <w:szCs w:val="24"/>
-        </w:rPr>
-      </w:pPr>
-      <w:r>
-        <w:rPr>
-          <w:rFonts w:eastAsia="Times New Roman"/>
-          <w:b/>
-          <w:bCs/>
-          <w:i/>
-          <w:iCs/>
-          <w:sz w:val="24"/>
-          <w:szCs w:val="24"/>
-        </w:rPr>
-        <w:t>7.3. Temporal Attention and Transformer-Based Score Refinement</w:t>
-      </w:r>
-    </w:p>
-    <w:p>
-      <w:pPr>
-        <w:spacing w:before="60" w:after="100" w:line="276" w:lineRule="auto"/>
-        <w:jc w:val="both"/>
-        <w:rPr>
-          <w:sz w:val="24"/>
-          <w:szCs w:val="24"/>
-        </w:rPr>
-      </w:pPr>
-      <w:r>
-        <w:rPr>
-          <w:rFonts w:eastAsia="Times New Roman"/>
-          <w:sz w:val="24"/>
-          <w:szCs w:val="24"/>
-        </w:rPr>
-        <w:t xml:space="preserve">The ensemble score computation in PreCrash treats each temporal window independently, aggregating frame-level scores through post-processing rather than explicitly modelling long-range temporal dependencies across the full 150-frame sequence. Incorporating a </w:t>
-      </w:r>
-      <w:r>
-        <w:rPr>
-          <w:rFonts w:eastAsia="Times New Roman"/>
-          <w:i/>
-          <w:iCs/>
-          <w:sz w:val="24"/>
-          <w:szCs w:val="24"/>
-        </w:rPr>
-        <w:t>lightweight temporal transformer</w:t>
-      </w:r>
-      <w:r>
-        <w:rPr>
-          <w:rFonts w:eastAsia="Times New Roman"/>
-          <w:sz w:val="24"/>
-          <w:szCs w:val="24"/>
-        </w:rPr>
-        <w:t xml:space="preserve"> as a score refinement layer — operating on the sequence of raw ensemble scores rather than on raw visual features — would enable the framework to explicitly reason about risk trajectory shape, acceleration, and inflection points without imposing the </w:t>
-        <w:lastRenderedPageBreak/>
-        <w:t>computational burden of full end-to-end video transformer inference. This refinement layer could be trained on a small auxiliary set of labelled risk trajectories in a few-shot regime, extending the zero-shot framework toward a few-shot variant with minimal annotation cost.</w:t>
-      </w:r>
-    </w:p>
-    <w:p>
-      <w:pPr>
-        <w:spacing w:before="160" w:after="60"/>
-        <w:rPr>
-          <w:sz w:val="24"/>
-          <w:szCs w:val="24"/>
-        </w:rPr>
-      </w:pPr>
-      <w:r>
-        <w:rPr>
-          <w:rFonts w:eastAsia="Times New Roman"/>
-          <w:b/>
-          <w:bCs/>
-          <w:i/>
-          <w:iCs/>
-          <w:sz w:val="24"/>
-          <w:szCs w:val="24"/>
-        </w:rPr>
-        <w:t>7.4. Cross-Dataset Generalisation and Geographic Diversity</w:t>
-      </w:r>
-    </w:p>
-    <w:p>
-      <w:pPr>
-        <w:spacing w:before="60" w:after="100" w:line="276" w:lineRule="auto"/>
-        <w:jc w:val="both"/>
-        <w:rPr>
-          <w:sz w:val="24"/>
-          <w:szCs w:val="24"/>
-        </w:rPr>
-      </w:pPr>
-      <w:r>
-        <w:rPr>
-          <w:rFonts w:eastAsia="Times New Roman"/>
-          <w:sz w:val="24"/>
-          <w:szCs w:val="24"/>
-        </w:rPr>
-        <w:t>The evaluation presented in this work was conducted on the MM-AU benchmark, which, while comprehensive in accident typology, reflects a particular geographic and infrastructural distribution. Future work will assess the framework's generalisation across geographically diverse dashcam datasets — including D2-City (Chinese urban environments), DADA-2000 (driver attention in driving accidents), and the A3D dataset — with the objective of validating the zero-shot claim across substantially different road geometries, driving cultures, traffic density patterns, and regulatory environments. Cross-dataset evaluation without any form of adaptation would constitute the most rigorous validation of the framework's generalisation claim and is a priority for future benchmarking work.</w:t>
-      </w:r>
-    </w:p>
-    <w:p>
-      <w:pPr>
-        <w:spacing w:before="160" w:after="60"/>
-        <w:rPr>
-          <w:sz w:val="24"/>
-          <w:szCs w:val="24"/>
-        </w:rPr>
-      </w:pPr>
-      <w:r>
-        <w:rPr>
-          <w:rFonts w:eastAsia="Times New Roman"/>
-          <w:b/>
-          <w:bCs/>
-          <w:i/>
-          <w:iCs/>
-          <w:sz w:val="24"/>
-          <w:szCs w:val="24"/>
-        </w:rPr>
-        <w:t>7.5. Edge Deployment and Real-Time Embedded Implementation</w:t>
-      </w:r>
-    </w:p>
-    <w:p>
-      <w:pPr>
-        <w:spacing w:before="60" w:after="100" w:line="276" w:lineRule="auto"/>
-        <w:jc w:val="both"/>
-        <w:rPr>
-          <w:sz w:val="24"/>
-          <w:szCs w:val="24"/>
-        </w:rPr>
-      </w:pPr>
-      <w:r>
-        <w:rPr>
-          <w:rFonts w:eastAsia="Times New Roman"/>
-          <w:sz w:val="24"/>
-          <w:szCs w:val="24"/>
-        </w:rPr>
-        <w:t xml:space="preserve">The current implementation executes on an NVIDIA T4 GPU in a cloud inference setting. Practical vehicular deployment requires execution on resource-constrained embedded platforms — including automotive-grade system-on-chip devices (e.g., NVIDIA Jetson Orin, Qualcomm Snapdragon Ride) — under strict latency, power, and thermal constraints. Future work will investigate </w:t>
-      </w:r>
-      <w:r>
-        <w:rPr>
-          <w:rFonts w:eastAsia="Times New Roman"/>
-          <w:i/>
-          <w:iCs/>
-          <w:sz w:val="24"/>
-          <w:szCs w:val="24"/>
-        </w:rPr>
-        <w:t>model quantisation, structured pruning, and knowledge distillation</w:t>
-      </w:r>
-      <w:r>
-        <w:rPr>
-          <w:rFonts w:eastAsia="Times New Roman"/>
-          <w:sz w:val="24"/>
-          <w:szCs w:val="24"/>
-        </w:rPr>
-        <w:t xml:space="preserve"> strategies for compressing the CLIP ViT-L/14 encoder and the frame-differencing pipeline to meet embedded deployment targets (target: ≤50 ms per frame end-to-end latency at 30 FPS). The modular, decoupled architecture of PreCrash is particularly amenable to selective component compression, as each modality engine can be independently quantised and validated without affecting the other engines or the fusion layer.</w:t>
-      </w:r>
-    </w:p>
-    <w:p>
-      <w:pPr>
-        <w:spacing w:before="160" w:after="60"/>
-        <w:rPr>
-          <w:sz w:val="24"/>
-          <w:szCs w:val="24"/>
-        </w:rPr>
-      </w:pPr>
-      <w:r>
-        <w:rPr>
-          <w:rFonts w:eastAsia="Times New Roman"/>
-          <w:b/>
-          <w:bCs/>
-          <w:i/>
-          <w:iCs/>
-          <w:sz w:val="24"/>
-          <w:szCs w:val="24"/>
-        </w:rPr>
-        <w:t>7.6. Regulatory Integration and Driver Behaviour Studies</w:t>
-      </w:r>
-    </w:p>
-    <w:p>
-      <w:pPr>
-        <w:spacing w:before="60" w:after="100" w:line="276" w:lineRule="auto"/>
-        <w:jc w:val="both"/>
-        <w:rPr>
-          <w:sz w:val="24"/>
-          <w:szCs w:val="24"/>
-        </w:rPr>
-      </w:pPr>
-      <w:r>
-        <w:rPr>
-          <w:rFonts w:eastAsia="Times New Roman"/>
-          <w:sz w:val="24"/>
-          <w:szCs w:val="24"/>
-        </w:rPr>
-        <w:t xml:space="preserve">Beyond the technical dimension, the deployment of PreCrash in production vehicles raises important questions regarding human-machine interaction, driver trust calibration, and regulatory acceptance. Future work will investigate the </w:t>
-      </w:r>
-      <w:r>
-        <w:rPr>
-          <w:rFonts w:eastAsia="Times New Roman"/>
-          <w:i/>
-          <w:iCs/>
-          <w:sz w:val="24"/>
-          <w:szCs w:val="24"/>
-        </w:rPr>
-        <w:t>optimal alert modality and timing strategy</w:t>
-      </w:r>
-      <w:r>
-        <w:rPr>
-          <w:rFonts w:eastAsia="Times New Roman"/>
-          <w:sz w:val="24"/>
-          <w:szCs w:val="24"/>
-        </w:rPr>
-        <w:t xml:space="preserve"> for communicating 4+ second anticipation warnings to human drivers — a challenge distinct from near-collision braking, where driver override is neither expected nor desirable. Controlled driving simulation studies examining driver response latency, trust calibration, and alert fatigue as functions of warning lead-time and presentation modality will be conducted. Concurrently, engagement with emerging regulatory frameworks for AI transparency in safety-critical systems — including EU AI Act provisions for high-risk automotive applications — will guide the formalisation of interpretability requirements for the modality-level attribution mechanism.</w:t>
-      </w:r>
-    </w:p>
-    <w:p>
-      <w:pPr>
-        <w:spacing w:before="60" w:after="100" w:line="276" w:lineRule="auto"/>
-        <w:jc w:val="both"/>
-        <w:rPr>
-          <w:sz w:val="24"/>
-          <w:szCs w:val="24"/>
-        </w:rPr>
-      </w:pPr>
-      <w:r>
-        <w:rPr>
-          <w:rFonts w:eastAsia="Times New Roman"/>
-          <w:sz w:val="24"/>
-          <w:szCs w:val="24"/>
-        </w:rPr>
-        <w:t>In summary, PreCrash establishes that zero-shot, training-free accident anticipation is not merely a theoretical possibility but a practically achievable and measurably effective operational capability. The results call for a re-evaluation of the assumption that safety-critical visual understanding systems categorically require large, domain-specific labelled datasets — and position pre-trained Vision-Language Model ensembles as a viable, scalable foundation for the next generation of intelligent road safety system.</w:t>
+        <w:t xml:space="preserve">Three things are consequently cheap that were not. A video-blind control costs a single submission and settles in an afternoon whether a reported score is measuring a method or a metric; we would like it to become as routine as a majority-class baseline in classification. Probe submissions turn a leaderboard into a means of auditing a scorer whose code is closed, without labels and without the weights. And an earliness term that is bounded per clip and conditioned on a fixed operating point of the discrimination metric, rather than summed raw, gives the field a composite it can compare across corpora. Demonstrating that corrected protocol end to end on a benchmark that publishes its annotations — where the discrimination half can actually be computed, and where the question of what a bounded earliness term costs a real method can finally be answered — is the natural next study, and it is the one we intend.</w:t>
       </w:r>
     </w:p>
     <w:p>

</xml_diff>

<commit_message>
Crisper introduction: 1,090 words to 757
Two passes. The first merged the two paragraphs that separately
explained the boundedness problem and the trivial maximiser, since the
second is a consequence of the first and the reader gets both faster
together. The second was pure compression.

Nothing in the argument is lost. Every number, every citation and every
clause of the scope disclaimer survives -- the disclaimer does
protective work and was tightened, not trimmed. What went was
repetition between adjacent paragraphs, the scope paragraph's closing
restatement of its own point, and about a sixth of each contribution
bullet.

Toward the 12,000-word target: body is 15,572, so 3,572 remain. The
weight is in 5.6, the pre-leaderboard proxy material at 2,845 words
across four tables, and in Section 4 at 4,008.
</commit_message>
<xml_diff>
--- a/paper/Precrash.docx
+++ b/paper/Precrash.docx
@@ -334,7 +334,7 @@
           <w:szCs w:val="24"/>
         </w:rPr>
         <w:lastRenderedPageBreak/>
-        <w:t xml:space="preserve">The World Health Organization [1] records approximately 1.19 million road traffic deaths every year, and far more people left with permanent disability. A large share of those deaths are in principle foreseeable in the seconds before they occur, which is what makes anticipation — as opposed to detection after the fact — worth pursuing as an obligation and not only as a research problem — the case the review of Zhang Y. et al. [2] sets out at length. Modern vehicles already carry the necessary instrument. A dashcam holds the primary visual record of the driving environment, including the sudden lane change, the pedestrian stepping off the kerb, and the hard braking of the vehicle ahead, which is the material Moura et al. [3] assembled into a public collision-prediction corpus. That record is used almost entirely in retrospect, to establish what happened after a collision. The question motivating this work was whether it could be used prospectively instead.</w:t>
+        <w:t xml:space="preserve">Road traffic injury kills approximately 1.19 million people a year by the World Health Organization's count [1]. Many of those deaths are foreseeable in the seconds before they occur, which is what makes anticipation — as distinct from detection after the fact — worth pursuing, as the review of Zhang Y. et al. [2] sets out. The instrument is already in the vehicle: a dashcam holds the primary visual record of the road, the material Moura et al. [3] assembled into a public corpus. It is used almost entirely in retrospect. Whether it can be used prospectively is the question that motivated this work.</w:t>
       </w:r>
     </w:p>
     <w:p>
@@ -345,6 +345,14 @@
           <w:szCs w:val="24"/>
         </w:rPr>
       </w:pPr>
+      <w:r>
+        <w:rPr>
+          <w:sz w:val="24"/>
+          <w:szCs w:val="24"/>
+        </w:rPr>
+        <w:lastRenderedPageBreak/>
+        <w:t xml:space="preserve">We built a training-free system to find out: a zero-shot ensemble scoring each frame of a dashcam clip for collision risk from vision–language similarity, a motion signal and a text-anchored prior, with no accident supervision at any stage. We entered it in a public competition, where the organisers scored it against ground truth we never held. It placed ninth of thirteen.</w:t>
+      </w:r>
     </w:p>
     <w:p>
       <w:pPr>
@@ -359,7 +367,8 @@
           <w:sz w:val="24"/>
           <w:szCs w:val="24"/>
         </w:rPr>
-        <w:t>We set out to answer it with a training-free system: a zero-shot ensemble that scores each frame of a dashcam clip for collision risk by combining vision–language similarity against danger and safety prompts, a motion-energy signal, and a text-anchored score, with no supervision from accident labels at any stage. We entered it in a public competition, the Zero-shot Accident Anticipation challenge hosted by AUTOPILOT, where it was scored by the organisers against ground truth we never held. It placed ninth of thirteen.</w:t>
+        <w:lastRenderedPageBreak/>
+        <w:t xml:space="preserve">This paper is not about that system. It is about what we found when we tried to understand the score it received.</w:t>
       </w:r>
     </w:p>
     <w:p>
@@ -370,6 +379,14 @@
           <w:szCs w:val="24"/>
         </w:rPr>
       </w:pPr>
+      <w:r>
+        <w:rPr>
+          <w:sz w:val="24"/>
+          <w:szCs w:val="24"/>
+        </w:rPr>
+        <w:lastRenderedPageBreak/>
+        <w:t xml:space="preserve">The competition scores submissions with a composite metric: a weighted sum of average precision (AP), area under the ROC curve (AUC), and two earliness measures — time-to-accident (TTA) and stable time-to-accident (STTA) — each read at a risk threshold of 0.5. The composition is intuitive, and it is becoming common. An anticipator should both separate accident clips from normal driving and raise the alarm early, and summing terms that measure each seems a reasonable way to ask for both.</w:t>
+      </w:r>
     </w:p>
     <w:p>
       <w:pPr>
@@ -384,7 +401,8 @@
           <w:sz w:val="24"/>
           <w:szCs w:val="24"/>
         </w:rPr>
-        <w:t>This paper is not about that system. It is about what we found when we tried to understand the score it received.</w:t>
+        <w:lastRenderedPageBreak/>
+        <w:t xml:space="preserve">It is not. AP and AUC are bounded on the unit interval; TTA and STTA are counted in frames and bounded only by the clip, which is 150 frames here. Summing a bounded quantity with an unbounded one lets the unbounded one decide the ranking, and here the timing terms are worth 5.70 times what discrimination contributes to a submission that reads nothing. Worse, the two share a trivial global maximiser: a score that exceeds 0.5 at frame 0 and never falls attains, on every clip, the largest value that clip admits for both. No method that reads the video can exceed it; a method can only match it and then compete on AP and AUC, worth 0.35105 to a blind submission.</w:t>
       </w:r>
     </w:p>
     <w:p>
@@ -395,6 +413,14 @@
           <w:szCs w:val="24"/>
         </w:rPr>
       </w:pPr>
+      <w:r>
+        <w:rPr>
+          <w:sz w:val="24"/>
+          <w:szCs w:val="24"/>
+        </w:rPr>
+        <w:lastRenderedPageBreak/>
+        <w:t xml:space="preserve">So we submitted the constant. It scored 2.35291 against a winning score of 2.50165, matching the eighth-placed team at the precision the leaderboard displays.</w:t>
+      </w:r>
     </w:p>
     <w:p>
       <w:pPr>
@@ -409,107 +435,8 @@
           <w:sz w:val="24"/>
           <w:szCs w:val="24"/>
         </w:rPr>
-        <w:t>The competition scores submissions with a composite metric: a weighted sum of average precision (AP), area under the ROC curve (AUC), and two earliness measures — time-to-accident (TTA) and stable time-to-accident (STTA) — each evaluated at a risk threshold of 0.5. The composition is intuitive, and it is becoming common. A useful anticipator should both separate accident clips from normal driving and raise the alarm early, and summing terms that measure each seems a reasonable way to ask for both.</w:t>
-      </w:r>
-    </w:p>
-    <w:p>
-      <w:pPr>
-        <w:jc w:val="both"/>
-        <w:rPr>
-          <w:sz w:val="24"/>
-          <w:szCs w:val="24"/>
-        </w:rPr>
-      </w:pPr>
-    </w:p>
-    <w:p>
-      <w:pPr>
-        <w:jc w:val="both"/>
-        <w:rPr>
-          <w:sz w:val="24"/>
-          <w:szCs w:val="24"/>
-        </w:rPr>
-      </w:pPr>
-      <w:r>
-        <w:rPr>
-          <w:sz w:val="24"/>
-          <w:szCs w:val="24"/>
-        </w:rPr>
-        <w:t>It is not. AP and AUC are bounded on the unit interval. TTA and STTA are measured in frames and are bounded only by the length of the clip, which is 150 frames here. Summing a bounded quantity with an unbounded one means the unbounded one decides the ranking, and on this benchmark the arithmetic is not subtle: the timing terms are worth 5.70 times everything the discrimination terms contribute to a submission that reads nothing.</w:t>
-      </w:r>
-    </w:p>
-    <w:p>
-      <w:pPr>
-        <w:jc w:val="both"/>
-        <w:rPr>
-          <w:sz w:val="24"/>
-          <w:szCs w:val="24"/>
-        </w:rPr>
-      </w:pPr>
-    </w:p>
-    <w:p>
-      <w:pPr>
-        <w:jc w:val="both"/>
-        <w:rPr>
-          <w:sz w:val="24"/>
-          <w:szCs w:val="24"/>
-        </w:rPr>
-      </w:pPr>
-      <w:r>
-        <w:rPr>
-          <w:sz w:val="24"/>
-          <w:szCs w:val="24"/>
-        </w:rPr>
-        <w:t>Worse, the timing terms have a trivial global maximiser. TTA is the largest interval between the accident frame and any frame at which predicted risk exceeds the threshold; STTA is the largest such interval over which risk stays above the threshold without interruption. A constant risk score of 0.51 crosses the threshold at frame 0 and never falls, so it attains, on every clip, exactly the maximum value that clip admits, for both terms simultaneously. No method that reads the video can exceed it there. A method can only match it, and then compete on AP and AUC, which we show below are worth 0.35105 to a blind submission.</w:t>
-      </w:r>
-    </w:p>
-    <w:p>
-      <w:pPr>
-        <w:jc w:val="both"/>
-        <w:rPr>
-          <w:sz w:val="24"/>
-          <w:szCs w:val="24"/>
-        </w:rPr>
-      </w:pPr>
-    </w:p>
-    <w:p>
-      <w:pPr>
-        <w:jc w:val="both"/>
-        <w:rPr>
-          <w:sz w:val="24"/>
-          <w:szCs w:val="24"/>
-        </w:rPr>
-      </w:pPr>
-      <w:r>
-        <w:rPr>
-          <w:sz w:val="24"/>
-          <w:szCs w:val="24"/>
-        </w:rPr>
-        <w:t>So we submitted the constant. It scored 2.35291 against a winning score of 2.50165, matching the eighth-placed team at the precision the leaderboard displays.</w:t>
-      </w:r>
-    </w:p>
-    <w:p>
-      <w:pPr>
-        <w:jc w:val="both"/>
-        <w:rPr>
-          <w:sz w:val="24"/>
-          <w:szCs w:val="24"/>
-        </w:rPr>
-      </w:pPr>
-    </w:p>
-    <w:p>
-      <w:pPr>
-        <w:jc w:val="both"/>
-        <w:rPr>
-          <w:sz w:val="24"/>
-          <w:szCs w:val="24"/>
-        </w:rPr>
-      </w:pPr>
-      <w:r>
-        <w:rPr>
-          <w:sz w:val="24"/>
-          <w:szCs w:val="24"/>
-        </w:rPr>
-        <w:t>The major contributions of this work are as follows.</w:t>
+        <w:lastRenderedPageBreak/>
+        <w:t xml:space="preserve">The contributions of this work are as follows.</w:t>
       </w:r>
     </w:p>
     <w:p>
@@ -530,7 +457,7 @@
           <w:sz w:val="24"/>
           <w:szCs w:val="24"/>
         </w:rPr>
-        <w:t>A measured demonstration on a live benchmark. A video-blind constant matches the eighth-placed private score and exceeds those of five of thirteen teams, including our own. Every leaderboard score reported here was computed by the competition's own scoring service against ground truth we do not have; we implemented none of the metrics. All derived quantities are our arithmetic on those scores, and are marked as such.</w:t>
+        <w:t xml:space="preserve">A measured demonstration on a live benchmark. A video-blind constant matches the eighth-placed private score and exceeds five of thirteen teams, our own included. Every leaderboard score here was computed by the competition's scoring service against ground truth we do not have; derived quantities are our arithmetic on those scores and are marked as such.</w:t>
       </w:r>
     </w:p>
     <w:p>
@@ -551,7 +478,7 @@
           <w:sz w:val="24"/>
           <w:szCs w:val="24"/>
         </w:rPr>
-        <w:t>A black-box decomposition of a composite metric. We introduce a probe methodology — families of video-blind submissions constructed so that unknown terms cancel under differencing — and use it to separate a metric whose weights are undisclosed and whose labels are withheld. It recovers the discrimination floor, both timing terms, the score's slope in the crossing frame, and the support and mean of the accident-onset distribution.</w:t>
+        <w:t xml:space="preserve">A black-box decomposition. Video-blind probes, built so that unknown terms cancel under differencing, separate a metric whose weights are undisclosed and whose labels are withheld — recovering the discrimination floor, both timing terms, the slope in the crossing frame, and the accident-onset distribution.</w:t>
       </w:r>
     </w:p>
     <w:p>
@@ -572,8 +499,7 @@
           <w:sz w:val="24"/>
           <w:szCs w:val="24"/>
         </w:rPr>
-        <w:lastRenderedPageBreak/>
-        <w:t>Evidence that the published metric definition does not reproduce the scorer. Three curves that cross the threshold at the same frame, with identical values at the crossing and no subsequent dip, receive scores spanning 0.091. Under the stated formula they must be equal. An entrant therefore cannot compute this benchmark's score from its published definition even given the labels, which is a reportable fact about the benchmark independent of everything above.</w:t>
+        <w:t xml:space="preserve">Evidence that the published definition does not reproduce the scorer. Three curves crossing at the same frame, with identical values at the crossing, score 0.091 apart; under the stated formula they must be equal. The score cannot be computed from the published definition even given the labels.</w:t>
       </w:r>
     </w:p>
     <w:p>
@@ -594,7 +520,7 @@
           <w:sz w:val="24"/>
           <w:szCs w:val="24"/>
         </w:rPr>
-        <w:t>A case study in which we are the subject, and a corrected protocol. Our own entry scores below the constant. We report this rather than omit it, because it is the clearest available illustration that a composite score of this shape does not measure what its name suggests. From the mechanisms we derive six requirements, of which the first — report a video-blind control with every anticipation result — costs an afternoon and would have caught this.</w:t>
+        <w:t xml:space="preserve">A case study in which we are the subject, and a six-point protocol. Our own entry scores below the constant and we report it. The protocol's first item — report a video-blind control with every result — costs an afternoon and would have caught this.</w:t>
       </w:r>
     </w:p>
     <w:p>
@@ -610,7 +536,8 @@
           <w:sz w:val="24"/>
           <w:szCs w:val="24"/>
         </w:rPr>
-        <w:t>We wish to be explicit about scope, because this paper reports a number that sits beside other teams' numbers. We make no claim about the validity, quality or honesty of any other submission or published method. We did not re-run anyone's system, we do not have anyone's code, and we could not evaluate it if we did, because the labels are withheld from every entrant. Where we observe that a leaderboard score is numerically identical to a control's, we are stating an arithmetic fact about two published numbers and drawing exactly one inference from it: that the metric assigns those two submissions the same value. We do not infer what any submission contained, and we note that a whole family of curves receives that identical score, which is precisely the property under examination. The claim of this paper is about a metric, demonstrated on one benchmark. It is not a claim about a field, and not a claim about anybody's method.</w:t>
+        <w:lastRenderedPageBreak/>
+        <w:t xml:space="preserve">One point of scope, because this paper prints a number beside other teams' numbers. We make no claim about any other submission or published method: we did not re-run anyone's system, and could not have evaluated it if we had, because the labels are withheld from every entrant. Where a leaderboard score is numerically identical to a control's, we state that arithmetic fact and draw one inference — the metric assigns the two submissions the same value. A whole family of curves receives it, which is precisely the property under examination.</w:t>
       </w:r>
     </w:p>
     <w:p>
@@ -621,21 +548,13 @@
           <w:szCs w:val="24"/>
         </w:rPr>
       </w:pPr>
-    </w:p>
-    <w:p>
-      <w:pPr>
-        <w:jc w:val="both"/>
-        <w:rPr>
-          <w:sz w:val="24"/>
-          <w:szCs w:val="24"/>
-        </w:rPr>
-      </w:pPr>
-      <w:r>
-        <w:rPr>
-          <w:sz w:val="24"/>
-          <w:szCs w:val="24"/>
-        </w:rPr>
-        <w:t>The rest of the paper is organised as follows. Section 2 reviews accident anticipation and the evaluation practice this work examines. Section 3 states the benchmark and its metric exactly, and establishes what an entrant can and cannot compute from them. Section 4 describes the system that was entered, the video-blind control family, and the probe design. Section 5 reports the measurements. Section 6 analyses why the composition fails. Section 7 sets out the corrected protocol, Section 8 the limitations, and Section 9 concludes.</w:t>
+      <w:r>
+        <w:rPr>
+          <w:sz w:val="24"/>
+          <w:szCs w:val="24"/>
+        </w:rPr>
+        <w:lastRenderedPageBreak/>
+        <w:t xml:space="preserve">Section 2 reviews the field's evaluation practice, Section 3 states the benchmark and its metric, and Section 4 describes the system, the controls and the probes. Section 5 reports the measurements, Section 6 analyses why the composition fails, and Sections 7 to 9 give the protocol, the limitations and the conclusion.</w:t>
       </w:r>
     </w:p>
     <w:p>

</xml_diff>

<commit_message>
Place the decomposition figure in 5.3 as Figure 4
The paper had three figures, all in Section 4, all of the system.
Sections 5 to 9 -- where the finding is -- carried only tables. The
figure that shows the finding was built when the measurements were made
and never placed.

It goes at the end of 5.3: the official score against the frame at which
the risk curve crosses 0.5, with the fitted line over crossings up to
frame 100, the AP+AUC floor at 0.351, and the winning and our-own
leaderboard levels drawn across it. A reader who looks at nothing else
sees the argument.

The vector PDF is committed beside the document for the camera-ready
version; the embedded copy is 400 dpi raster.
</commit_message>
<xml_diff>
--- a/paper/Precrash.docx
+++ b/paper/Precrash.docx
@@ -14018,6 +14018,66 @@
           <w:szCs w:val="24"/>
         </w:rPr>
         <w:t>The line was then asked to predict curves it had not seen. Three logistic curves crossing at frames 60, 75 and 90 are predicted to within 6.4 × 10⁻³, and the closest of them to 6 × 10⁻⁵. The fourth, crossing at frame 105, lies beyond the region where the line was fitted and where the curve has already begun to bend; the model is not expected to hold there and we report it rather than omit a held-out point that missed.</w:t>
+      </w:r>
+    </w:p>
+    <w:p>
+      <w:pPr>
+        <w:jc w:val="center"/>
+      </w:pPr>
+      <w:r>
+        <w:drawing>
+          <wp:inline distT="0" distB="0" distL="0" distR="0">
+            <wp:extent cx="5486400" cy="3331464"/>
+            <wp:docPr id="4001" name="Figure 4" descr="Official score against the         frame at which the risk curve crosses 0.5, for video-blind         submissions"/>
+            <a:graphic xmlns:a="http://schemas.openxmlformats.org/drawingml/2006/main">
+              <a:graphicData uri="http://schemas.openxmlformats.org/drawingml/2006/picture">
+                <pic:pic xmlns:pic="http://schemas.openxmlformats.org/drawingml/2006/picture">
+                  <pic:nvPicPr>
+                    <pic:cNvPr id="0" name="fig_decomposition.png"/>
+                    <pic:cNvPicPr/>
+                  </pic:nvPicPr>
+                  <pic:blipFill>
+                    <a:blip r:embed="rId900"/>
+                    <a:stretch>
+                      <a:fillRect/>
+                    </a:stretch>
+                  </pic:blipFill>
+                  <pic:spPr>
+                    <a:xfrm>
+                      <a:off x="0" y="0"/>
+                      <a:ext cx="5486400" cy="3331464"/>
+                    </a:xfrm>
+                    <a:prstGeom prst="rect">
+                      <a:avLst/>
+                    </a:prstGeom>
+                  </pic:spPr>
+                </pic:pic>
+              </a:graphicData>
+            </a:graphic>
+          </wp:inline>
+        </w:drawing>
+      </w:r>
+    </w:p>
+    <w:p>
+      <w:pPr>
+        <w:jc w:val="center"/>
+        <w:rPr>
+          <w:b/>
+          <w:bCs/>
+          <w:sz w:val="24"/>
+          <w:szCs w:val="24"/>
+          <w:lang w:val="en-IN"/>
+        </w:rPr>
+      </w:pPr>
+      <w:r>
+        <w:rPr>
+          <w:b/>
+          <w:bCs/>
+          <w:sz w:val="24"/>
+          <w:szCs w:val="24"/>
+          <w:lang w:val="en-IN"/>
+        </w:rPr>
+        <w:t xml:space="preserve">Figure 4: The official score is a straight line in the frame at which the alarm fires. Points are video-blind submissions scored by the organisers; the fit is over crossings up to frame 100. A constant crosses at frame 0.</w:t>
       </w:r>
     </w:p>
     <w:p>

</xml_diff>